<commit_message>
docs: Added repo link to week 1 document
</commit_message>
<xml_diff>
--- a/docs/W1_Project_Milestone_1.docx
+++ b/docs/W1_Project_Milestone_1.docx
@@ -2,6 +2,24 @@
 <file path=word/document.xml><?xml version="1.0" encoding="utf-8"?>
 <w:document xmlns:o="urn:schemas-microsoft-com:office:office" xmlns:r="http://schemas.openxmlformats.org/officeDocument/2006/relationships" xmlns:v="urn:schemas-microsoft-com:vml" xmlns:w="http://schemas.openxmlformats.org/wordprocessingml/2006/main" xmlns:w10="urn:schemas-microsoft-com:office:word" xmlns:wp="http://schemas.openxmlformats.org/drawingml/2006/wordprocessingDrawing" xmlns:pic="http://schemas.openxmlformats.org/drawingml/2006/picture" xmlns:wps="http://schemas.microsoft.com/office/word/2010/wordprocessingShape" xmlns:wpg="http://schemas.microsoft.com/office/word/2010/wordprocessingGroup" xmlns:mc="http://schemas.openxmlformats.org/markup-compatibility/2006" xmlns:wp14="http://schemas.microsoft.com/office/word/2010/wordprocessingDrawing" xmlns:w14="http://schemas.microsoft.com/office/word/2010/wordml" xmlns:w15="http://schemas.microsoft.com/office/word/2012/wordml" mc:Ignorable="w14 wp14 w15">
   <w:body>
+    <w:p>
+      <w:pPr>
+        <w:pStyle w:val="Normal"/>
+        <w:bidi w:val="0"/>
+        <w:jc w:val="start"/>
+        <w:rPr/>
+      </w:pPr>
+      <w:hyperlink r:id="rId2">
+        <w:r>
+          <w:rPr>
+            <w:rStyle w:val="Hyperlink"/>
+            <w:b/>
+            <w:bCs/>
+          </w:rPr>
+          <w:t>REPO: https://github.com/GiftedR/IT-410-Project</w:t>
+        </w:r>
+      </w:hyperlink>
+    </w:p>
     <w:p>
       <w:pPr>
         <w:pStyle w:val="Normal"/>
@@ -77,7 +95,7 @@
                     </pic:cNvPicPr>
                   </pic:nvPicPr>
                   <pic:blipFill>
-                    <a:blip r:embed="rId2"/>
+                    <a:blip r:embed="rId3"/>
                     <a:stretch>
                       <a:fillRect/>
                     </a:stretch>
@@ -409,7 +427,7 @@
                     </pic:cNvPicPr>
                   </pic:nvPicPr>
                   <pic:blipFill>
-                    <a:blip r:embed="rId3"/>
+                    <a:blip r:embed="rId4"/>
                     <a:stretch>
                       <a:fillRect/>
                     </a:stretch>
@@ -438,6 +456,7 @@
       <w:pgNumType w:fmt="decimal"/>
       <w:formProt w:val="false"/>
       <w:textDirection w:val="lrTb"/>
+      <w:docGrid w:type="default" w:linePitch="100" w:charSpace="0"/>
     </w:sectPr>
   </w:body>
 </w:document>
@@ -457,7 +476,6 @@
     </w:rPrDefault>
     <w:pPrDefault>
       <w:pPr>
-        <w:widowControl/>
         <w:suppressAutoHyphens w:val="true"/>
       </w:pPr>
     </w:pPrDefault>
@@ -467,7 +485,10 @@
     <w:qFormat/>
     <w:pPr>
       <w:widowControl/>
+      <w:suppressAutoHyphens w:val="true"/>
       <w:bidi w:val="0"/>
+      <w:spacing w:before="0" w:after="0"/>
+      <w:jc w:val="start"/>
     </w:pPr>
     <w:rPr>
       <w:rFonts w:ascii="Liberation Serif" w:hAnsi="Liberation Serif" w:eastAsia="DejaVu Sans" w:cs="Noto Sans"/>
@@ -493,6 +514,13 @@
       <w:bCs/>
       <w:sz w:val="48"/>
       <w:szCs w:val="48"/>
+    </w:rPr>
+  </w:style>
+  <w:style w:type="character" w:styleId="Hyperlink">
+    <w:name w:val="Hyperlink"/>
+    <w:rPr>
+      <w:color w:val="000080"/>
+      <w:u w:val="single"/>
     </w:rPr>
   </w:style>
   <w:style w:type="paragraph" w:styleId="Heading">

</xml_diff>